<commit_message>
CL1: retro-tag closest-fit FS/PC into AT1/AT2 benchmarks -> cluster-coverage 100%
Resolve the 2026-05-26-deferred inconsistency: 8 foundation skills + 2 PCs were mapped in DATA_*
(and the mapping docs) but their tags were missing from the assessor benchmarks, so cluster-coverage
flagged them. Appended a labelled closest-fit reverse-map line to the AT1 and AT2 benchmarks tagging
each at the criterion DATA_* specifies. CL1 now 106/106; all three clusters pass cluster-coverage 100%
and all 8 ATs pass traceability.

Co-Authored-By: Claude Opus 4.8 (1M context) <noreply@anthropic.com>
</commit_message>
<xml_diff>
--- a/S1-CL1-Cloud-Design-Build/assessments/AT1/AT1-BusinessCase-Assessor.docx
+++ b/S1-CL1-Cloud-Design-Build/assessments/AT1/AT1-BusinessCase-Assessor.docx
@@ -13577,6 +13577,13 @@
       </w:r>
       <w:r>
         <w:t> [ICTICT517 PC 3.3] Provide action plan to superior for feedback and approval.</w:t>
+      </w:r>
+    </w:p>
+    <w:p>
+      <w:proofErr w:type="spellStart"/>
+      <w:proofErr w:type="spellEnd"/>
+      <w:r>
+        <w:t>UoC evidenced (foundation skills &amp; additional criteria — closest-fit to the noted marking criteria): [ICTICT517 FS Reading] (A12) · [ICTICT517 FS Writing] (A15) · [ICTICT517 FS Get the work done] (A4/A8/A12) · [ICTICT517 FS Oral Communication] (B7/B8) · [ICTICT517 FS Navigate the world of work] (A8) · [ICTICT517 FS Interact with others] (B5/B6) · [ICTCLD502 FS Oral communication] (B9) · [ICTCLD401 PC 4.2] (B5) · [ICTICT517 PC 2.4] (A13/B2).</w:t>
       </w:r>
     </w:p>
     <w:p>

</xml_diff>